<commit_message>
Improve generation alignment and documentation
</commit_message>
<xml_diff>
--- a/docs/dataset_training_methods_zh.docx
+++ b/docs/dataset_training_methods_zh.docx
@@ -2,17 +2,6 @@
 <file path=word/document.xml><?xml version="1.0" encoding="utf-8"?>
 <w:document xmlns:w="http://schemas.openxmlformats.org/wordprocessingml/2006/main" xmlns:m="http://schemas.openxmlformats.org/officeDocument/2006/math" xmlns:r="http://schemas.openxmlformats.org/officeDocument/2006/relationships" xmlns:o="urn:schemas-microsoft-com:office:office" xmlns:v="urn:schemas-microsoft-com:vml" xmlns:w10="urn:schemas-microsoft-com:office:word" xmlns:a="http://schemas.openxmlformats.org/drawingml/2006/main" xmlns:pic="http://schemas.openxmlformats.org/drawingml/2006/picture" xmlns:wp="http://schemas.openxmlformats.org/drawingml/2006/wordprocessingDrawing">
   <w:body>
-    <w:p>
-      <w:pPr>
-        <w:pStyle w:val="Title"/>
-      </w:pPr>
-      <w:r>
-        <w:rPr>
-          <w:rFonts w:hint="eastAsia"/>
-        </w:rPr>
-        <w:t xml:space="preserve">数据集、解析流程与训练方法说明</w:t>
-      </w:r>
-    </w:p>
     <w:bookmarkStart w:id="52" w:name="数据集解析流程与训练方法说明"/>
     <w:p>
       <w:pPr>
@@ -11252,6 +11241,276 @@
       </w:r>
       <w:r>
         <w:t xml:space="preserve"> de novo per-example fallback reason。</w:t>
+      </w:r>
+    </w:p>
+    <w:p>
+      <w:pPr>
+        <w:pStyle w:val="Compact"/>
+        <w:numPr>
+          <w:ilvl w:val="0"/>
+          <w:numId w:val="1027"/>
+        </w:numPr>
+      </w:pPr>
+      <w:r>
+        <w:t xml:space="preserve">primary component provenance、flow branch schedule report、branch component audit </w:t>
+      </w:r>
+      <w:r>
+        <w:rPr>
+          <w:rFonts w:hint="eastAsia"/>
+        </w:rPr>
+        <w:t xml:space="preserve">和</w:t>
+      </w:r>
+      <w:r>
+        <w:t xml:space="preserve"> objective-family budget report </w:t>
+      </w:r>
+      <w:r>
+        <w:rPr>
+          <w:rFonts w:hint="eastAsia"/>
+        </w:rPr>
+        <w:t xml:space="preserve">的解释逻辑已经集中到</w:t>
+      </w:r>
+      <w:r>
+        <w:t xml:space="preserve"> </w:t>
+      </w:r>
+      <w:r>
+        <w:rPr>
+          <w:rStyle w:val="VerbatimChar"/>
+        </w:rPr>
+        <w:t xml:space="preserve">src/training/metrics/</w:t>
+      </w:r>
+      <w:r>
+        <w:rPr>
+          <w:rFonts w:hint="eastAsia"/>
+        </w:rPr>
+        <w:t xml:space="preserve">，而不是留在</w:t>
+      </w:r>
+      <w:r>
+        <w:t xml:space="preserve"> trainer </w:t>
+      </w:r>
+      <w:r>
+        <w:rPr>
+          <w:rFonts w:hint="eastAsia"/>
+        </w:rPr>
+        <w:t xml:space="preserve">内部用字符串前缀判断。详细边界见</w:t>
+      </w:r>
+      <w:r>
+        <w:t xml:space="preserve"> </w:t>
+      </w:r>
+      <w:r>
+        <w:rPr>
+          <w:rStyle w:val="VerbatimChar"/>
+        </w:rPr>
+        <w:t xml:space="preserve">docs/training_metrics_audit.md</w:t>
+      </w:r>
+      <w:r>
+        <w:t xml:space="preserve">。</w:t>
+      </w:r>
+    </w:p>
+    <w:p>
+      <w:pPr>
+        <w:pStyle w:val="Compact"/>
+        <w:numPr>
+          <w:ilvl w:val="0"/>
+          <w:numId w:val="1027"/>
+        </w:numPr>
+      </w:pPr>
+      <w:r>
+        <w:t xml:space="preserve">branch schedule artifact </w:t>
+      </w:r>
+      <w:r>
+        <w:rPr>
+          <w:rFonts w:hint="eastAsia"/>
+        </w:rPr>
+        <w:t xml:space="preserve">中的每个</w:t>
+      </w:r>
+      <w:r>
+        <w:t xml:space="preserve"> branch </w:t>
+      </w:r>
+      <w:r>
+        <w:rPr>
+          <w:rFonts w:hint="eastAsia"/>
+        </w:rPr>
+        <w:t xml:space="preserve">会带</w:t>
+      </w:r>
+      <w:r>
+        <w:t xml:space="preserve"> </w:t>
+      </w:r>
+      <w:r>
+        <w:rPr>
+          <w:rStyle w:val="VerbatimChar"/>
+        </w:rPr>
+        <w:t xml:space="preserve">component_audit</w:t>
+      </w:r>
+      <w:r>
+        <w:rPr>
+          <w:rFonts w:hint="eastAsia"/>
+        </w:rPr>
+        <w:t xml:space="preserve">，记录该</w:t>
+      </w:r>
+      <w:r>
+        <w:t xml:space="preserve"> branch </w:t>
+      </w:r>
+      <w:r>
+        <w:rPr>
+          <w:rFonts w:hint="eastAsia"/>
+        </w:rPr>
+        <w:t xml:space="preserve">观察到的</w:t>
+      </w:r>
+      <w:r>
+        <w:t xml:space="preserve"> primary component </w:t>
+      </w:r>
+      <w:r>
+        <w:rPr>
+          <w:rFonts w:hint="eastAsia"/>
+        </w:rPr>
+        <w:t xml:space="preserve">名称、optimizer-facing</w:t>
+      </w:r>
+      <w:r>
+        <w:t xml:space="preserve"> component </w:t>
+      </w:r>
+      <w:r>
+        <w:rPr>
+          <w:rFonts w:hint="eastAsia"/>
+        </w:rPr>
+        <w:t xml:space="preserve">数量、diagnostic-only</w:t>
+      </w:r>
+      <w:r>
+        <w:t xml:space="preserve"> component </w:t>
+      </w:r>
+      <w:r>
+        <w:rPr>
+          <w:rFonts w:hint="eastAsia"/>
+        </w:rPr>
+        <w:t xml:space="preserve">数量和值汇总。该汇总只用于审计，不重新计算</w:t>
+      </w:r>
+      <w:r>
+        <w:t xml:space="preserve"> optimizer total。</w:t>
+      </w:r>
+    </w:p>
+    <w:p>
+      <w:pPr>
+        <w:pStyle w:val="Compact"/>
+        <w:numPr>
+          <w:ilvl w:val="0"/>
+          <w:numId w:val="1027"/>
+        </w:numPr>
+      </w:pPr>
+      <w:r>
+        <w:t xml:space="preserve">objective-family budget family </w:t>
+      </w:r>
+      <w:r>
+        <w:rPr>
+          <w:rFonts w:hint="eastAsia"/>
+        </w:rPr>
+        <w:t xml:space="preserve">固定为</w:t>
+      </w:r>
+      <w:r>
+        <w:t xml:space="preserve"> </w:t>
+      </w:r>
+      <w:r>
+        <w:rPr>
+          <w:rStyle w:val="VerbatimChar"/>
+        </w:rPr>
+        <w:t xml:space="preserve">task</w:t>
+      </w:r>
+      <w:r>
+        <w:t xml:space="preserve">、</w:t>
+      </w:r>
+      <w:r>
+        <w:rPr>
+          <w:rStyle w:val="VerbatimChar"/>
+        </w:rPr>
+        <w:t xml:space="preserve">rollout</w:t>
+      </w:r>
+      <w:r>
+        <w:t xml:space="preserve">、</w:t>
+      </w:r>
+      <w:r>
+        <w:rPr>
+          <w:rStyle w:val="VerbatimChar"/>
+        </w:rPr>
+        <w:t xml:space="preserve">pocket_interaction</w:t>
+      </w:r>
+      <w:r>
+        <w:t xml:space="preserve">、</w:t>
+      </w:r>
+      <w:r>
+        <w:rPr>
+          <w:rStyle w:val="VerbatimChar"/>
+        </w:rPr>
+        <w:t xml:space="preserve">chemistry</w:t>
+      </w:r>
+      <w:r>
+        <w:t xml:space="preserve">、</w:t>
+      </w:r>
+      <w:r>
+        <w:rPr>
+          <w:rStyle w:val="VerbatimChar"/>
+        </w:rPr>
+        <w:t xml:space="preserve">redundancy</w:t>
+      </w:r>
+      <w:r>
+        <w:t xml:space="preserve">、</w:t>
+      </w:r>
+      <w:r>
+        <w:rPr>
+          <w:rStyle w:val="VerbatimChar"/>
+        </w:rPr>
+        <w:t xml:space="preserve">probe</w:t>
+      </w:r>
+      <w:r>
+        <w:t xml:space="preserve">、</w:t>
+      </w:r>
+      <w:r>
+        <w:rPr>
+          <w:rStyle w:val="VerbatimChar"/>
+        </w:rPr>
+        <w:t xml:space="preserve">leakage</w:t>
+      </w:r>
+      <w:r>
+        <w:t xml:space="preserve">、</w:t>
+      </w:r>
+      <w:r>
+        <w:rPr>
+          <w:rStyle w:val="VerbatimChar"/>
+        </w:rPr>
+        <w:t xml:space="preserve">gate</w:t>
+      </w:r>
+      <w:r>
+        <w:t xml:space="preserve">、</w:t>
+      </w:r>
+      <w:r>
+        <w:rPr>
+          <w:rStyle w:val="VerbatimChar"/>
+        </w:rPr>
+        <w:t xml:space="preserve">slot</w:t>
+      </w:r>
+      <w:r>
+        <w:t xml:space="preserve">。warn/clamp </w:t>
+      </w:r>
+      <w:r>
+        <w:rPr>
+          <w:rFonts w:hint="eastAsia"/>
+        </w:rPr>
+        <w:t xml:space="preserve">逻辑在</w:t>
+      </w:r>
+      <w:r>
+        <w:t xml:space="preserve"> family </w:t>
+      </w:r>
+      <w:r>
+        <w:rPr>
+          <w:rFonts w:hint="eastAsia"/>
+        </w:rPr>
+        <w:t xml:space="preserve">聚合之后执行，方便审计辅助目标是否压过</w:t>
+      </w:r>
+      <w:r>
+        <w:t xml:space="preserve"> primary/rollout </w:t>
+      </w:r>
+      <w:r>
+        <w:rPr>
+          <w:rFonts w:hint="eastAsia"/>
+        </w:rPr>
+        <w:t xml:space="preserve">信号。</w:t>
       </w:r>
     </w:p>
     <w:p>

</xml_diff>